<commit_message>
Refresh Rmd examples for new Python models
</commit_message>
<xml_diff>
--- a/examples/autoencoder/doc/README.docx
+++ b/examples/autoencoder/doc/README.docx
@@ -2,7 +2,7 @@
 <file path=word/document.xml><?xml version="1.0" encoding="utf-8"?>
 <w:document xmlns:w="http://schemas.openxmlformats.org/wordprocessingml/2006/main" xmlns:m="http://schemas.openxmlformats.org/officeDocument/2006/math" xmlns:r="http://schemas.openxmlformats.org/officeDocument/2006/relationships" xmlns:o="urn:schemas-microsoft-com:office:office" xmlns:v="urn:schemas-microsoft-com:vml" xmlns:w10="urn:schemas-microsoft-com:office:word" xmlns:a="http://schemas.openxmlformats.org/drawingml/2006/main" xmlns:pic="http://schemas.openxmlformats.org/drawingml/2006/picture" xmlns:wp="http://schemas.openxmlformats.org/drawingml/2006/wordprocessingDrawing">
   <w:body>
-    <w:bookmarkStart w:id="34" w:name="autoencoders-examples"/>
+    <w:bookmarkStart w:id="23" w:name="autoencoders-examples"/>
     <w:p>
       <w:pPr>
         <w:pStyle w:val="Heading1"/>
@@ -97,7 +97,7 @@
           <w:numId w:val="1001"/>
         </w:numPr>
       </w:pPr>
-      <w:hyperlink r:id="rId20">
+      <w:hyperlink r:id="rId9">
         <w:r>
           <w:rPr>
             <w:rStyle w:val="Hyperlink"/>
@@ -119,7 +119,7 @@
           <w:numId w:val="1001"/>
         </w:numPr>
       </w:pPr>
-      <w:hyperlink r:id="rId21">
+      <w:hyperlink r:id="rId10">
         <w:r>
           <w:rPr>
             <w:rStyle w:val="Hyperlink"/>
@@ -141,7 +141,7 @@
           <w:numId w:val="1001"/>
         </w:numPr>
       </w:pPr>
-      <w:hyperlink r:id="rId22">
+      <w:hyperlink r:id="rId11">
         <w:r>
           <w:rPr>
             <w:rStyle w:val="Hyperlink"/>
@@ -163,7 +163,7 @@
           <w:numId w:val="1001"/>
         </w:numPr>
       </w:pPr>
-      <w:hyperlink r:id="rId23">
+      <w:hyperlink r:id="rId12">
         <w:r>
           <w:rPr>
             <w:rStyle w:val="Hyperlink"/>
@@ -185,7 +185,7 @@
           <w:numId w:val="1001"/>
         </w:numPr>
       </w:pPr>
-      <w:hyperlink r:id="rId24">
+      <w:hyperlink r:id="rId13">
         <w:r>
           <w:rPr>
             <w:rStyle w:val="Hyperlink"/>
@@ -207,7 +207,7 @@
           <w:numId w:val="1001"/>
         </w:numPr>
       </w:pPr>
-      <w:hyperlink r:id="rId25">
+      <w:hyperlink r:id="rId14">
         <w:r>
           <w:rPr>
             <w:rStyle w:val="Hyperlink"/>
@@ -229,7 +229,7 @@
           <w:numId w:val="1001"/>
         </w:numPr>
       </w:pPr>
-      <w:hyperlink r:id="rId26">
+      <w:hyperlink r:id="rId15">
         <w:r>
           <w:rPr>
             <w:rStyle w:val="Hyperlink"/>
@@ -251,7 +251,7 @@
           <w:numId w:val="1001"/>
         </w:numPr>
       </w:pPr>
-      <w:hyperlink r:id="rId27">
+      <w:hyperlink r:id="rId16">
         <w:r>
           <w:rPr>
             <w:rStyle w:val="Hyperlink"/>
@@ -273,7 +273,7 @@
           <w:numId w:val="1001"/>
         </w:numPr>
       </w:pPr>
-      <w:hyperlink r:id="rId28">
+      <w:hyperlink r:id="rId17">
         <w:r>
           <w:rPr>
             <w:rStyle w:val="Hyperlink"/>
@@ -295,7 +295,7 @@
           <w:numId w:val="1001"/>
         </w:numPr>
       </w:pPr>
-      <w:hyperlink r:id="rId29">
+      <w:hyperlink r:id="rId18">
         <w:r>
           <w:rPr>
             <w:rStyle w:val="Hyperlink"/>
@@ -317,7 +317,7 @@
           <w:numId w:val="1001"/>
         </w:numPr>
       </w:pPr>
-      <w:hyperlink r:id="rId30">
+      <w:hyperlink r:id="rId19">
         <w:r>
           <w:rPr>
             <w:rStyle w:val="Hyperlink"/>
@@ -339,7 +339,7 @@
           <w:numId w:val="1001"/>
         </w:numPr>
       </w:pPr>
-      <w:hyperlink r:id="rId31">
+      <w:hyperlink r:id="rId20">
         <w:r>
           <w:rPr>
             <w:rStyle w:val="Hyperlink"/>
@@ -361,7 +361,7 @@
           <w:numId w:val="1001"/>
         </w:numPr>
       </w:pPr>
-      <w:hyperlink r:id="rId32">
+      <w:hyperlink r:id="rId21">
         <w:r>
           <w:rPr>
             <w:rStyle w:val="Hyperlink"/>
@@ -383,7 +383,7 @@
           <w:numId w:val="1001"/>
         </w:numPr>
       </w:pPr>
-      <w:hyperlink r:id="rId33">
+      <w:hyperlink r:id="rId22">
         <w:r>
           <w:rPr>
             <w:rStyle w:val="Hyperlink"/>
@@ -398,7 +398,7 @@
         <w:t xml:space="preserve">— Variational autoencoder (encode-decode) optimizing the ELBO (reconstruction + KL) for a smooth latent space.</w:t>
       </w:r>
     </w:p>
-    <w:bookmarkEnd w:id="34"/>
+    <w:bookmarkEnd w:id="23"/>
     <w:sectPr>
       <w:footnotePr>
         <w:numRestart w:val="eachSect"/>
@@ -626,10 +626,10 @@
   <w:docDefaults>
     <w:rPrDefault>
       <w:rPr>
-        <w:rFonts w:asciiTheme="minorHAnsi" w:cstheme="minorBidi" w:eastAsiaTheme="minorHAnsi" w:hAnsiTheme="minorHAnsi"/>
+        <w:rFonts w:asciiTheme="minorHAnsi" w:cstheme="minorBidi" w:eastAsiaTheme="minorEastAsia" w:hAnsiTheme="minorHAnsi"/>
         <w:sz w:val="24"/>
         <w:szCs w:val="24"/>
-        <w:lang w:bidi="ar-SA" w:eastAsia="en-US" w:val="en-US"/>
+        <w:lang w:bidi="ar-SA" w:eastAsia="zh-CN" w:val="en-US"/>
       </w:rPr>
     </w:rPrDefault>
     <w:pPrDefault>
@@ -1170,13 +1170,6 @@
       </w:tblCellMar>
     </w:tblPr>
     <w:tblStylePr w:type="firstRow">
-      <w:tblPr>
-        <w:jc w:val="left"/>
-        <w:tblInd w:type="dxa" w:w="0"/>
-      </w:tblPr>
-      <w:trPr>
-        <w:jc w:val="left"/>
-      </w:trPr>
       <w:tcPr>
         <w:tcBorders>
           <w:bottom w:val="single"/>

</xml_diff>